<commit_message>
Atualiza o Documento de Arquitetura e o Guia de Implementação para os pacotes por camada
</commit_message>
<xml_diff>
--- a/2.Analise e Design/CARREGAJA - Documento de Arquitetura.docx
+++ b/2.Analise e Design/CARREGAJA - Documento de Arquitetura.docx
@@ -15,7 +15,7 @@
         <w:pStyle w:val="Titulodocumento"/>
       </w:pPr>
       <w:r>
-        <w:t>Versão 1.0</w:t>
+        <w:t>Versão 1.1</w:t>
       </w:r>
     </w:p>
     <w:p>
@@ -50,8 +50,8 @@
       <w:tblGrid>
         <w:gridCol w:w="1218"/>
         <w:gridCol w:w="885"/>
-        <w:gridCol w:w="6019"/>
-        <w:gridCol w:w="1732"/>
+        <w:gridCol w:w="6135"/>
+        <w:gridCol w:w="1616"/>
       </w:tblGrid>
       <w:tr>
         <w:trPr>
@@ -102,7 +102,7 @@
         </w:tc>
         <w:tc>
           <w:tcPr>
-            <w:tcW w:w="3054" w:type="pct"/>
+            <w:tcW w:w="3113" w:type="pct"/>
             <w:shd w:val="clear" w:color="auto" w:fill="D9D9D9"/>
           </w:tcPr>
           <w:p>
@@ -123,7 +123,7 @@
         </w:tc>
         <w:tc>
           <w:tcPr>
-            <w:tcW w:w="880" w:type="pct"/>
+            <w:tcW w:w="820" w:type="pct"/>
             <w:shd w:val="clear" w:color="auto" w:fill="D9D9D9"/>
           </w:tcPr>
           <w:p>
@@ -177,7 +177,7 @@
         </w:tc>
         <w:tc>
           <w:tcPr>
-            <w:tcW w:w="3054" w:type="pct"/>
+            <w:tcW w:w="3113" w:type="pct"/>
           </w:tcPr>
           <w:p>
             <w:pPr>
@@ -191,7 +191,68 @@
         </w:tc>
         <w:tc>
           <w:tcPr>
-            <w:tcW w:w="880" w:type="pct"/>
+            <w:tcW w:w="820" w:type="pct"/>
+          </w:tcPr>
+          <w:p>
+            <w:pPr>
+              <w:spacing w:after="40"/>
+              <w:jc w:val="left"/>
+            </w:pPr>
+            <w:r>
+              <w:t>Henrique de Almeida Marangoni Inacio</w:t>
+            </w:r>
+          </w:p>
+        </w:tc>
+      </w:tr>
+      <w:tr>
+        <w:trPr>
+          <w:cantSplit/>
+        </w:trPr>
+        <w:tc>
+          <w:tcPr>
+            <w:tcW w:w="618" w:type="pct"/>
+          </w:tcPr>
+          <w:p>
+            <w:pPr>
+              <w:spacing w:after="40"/>
+              <w:jc w:val="left"/>
+            </w:pPr>
+            <w:r>
+              <w:t>26/10/2026</w:t>
+            </w:r>
+          </w:p>
+        </w:tc>
+        <w:tc>
+          <w:tcPr>
+            <w:tcW w:w="449" w:type="pct"/>
+          </w:tcPr>
+          <w:p>
+            <w:pPr>
+              <w:spacing w:after="40"/>
+              <w:jc w:val="left"/>
+            </w:pPr>
+            <w:r>
+              <w:t>1.1</w:t>
+            </w:r>
+          </w:p>
+        </w:tc>
+        <w:tc>
+          <w:tcPr>
+            <w:tcW w:w="3113" w:type="pct"/>
+          </w:tcPr>
+          <w:p>
+            <w:pPr>
+              <w:spacing w:after="40"/>
+              <w:jc w:val="left"/>
+            </w:pPr>
+            <w:r>
+              <w:t>Pacotes organizados por camada, e não por caso de uso (seções 2.2, 3 e 8). Diagramas do UC05 no pacote 3.Arquitetura::manterveiculo e implantação em 3.Arquitetura::implantação.</w:t>
+            </w:r>
+          </w:p>
+        </w:tc>
+        <w:tc>
+          <w:tcPr>
+            <w:tcW w:w="820" w:type="pct"/>
           </w:tcPr>
           <w:p>
             <w:pPr>
@@ -225,7 +286,10 @@
     </w:p>
     <w:p>
       <w:r>
-        <w:t>Este documento descreve a arquitetura do CARREGAJA: as decisões técnicas, os requisitos não funcionais que as motivaram, a organização em camadas e pacotes, a implantação e o resultado do teste da arquitetura com o caso de uso escolhido. É a referência para quem implementa os casos de uso da Construção, junto com o Guia de Implementação.</w:t>
+        <w:t xml:space="preserve">Este documento descreve a arquitetura do CARREGAJA: as decisões técnicas, os requisitos não funcionais que as motivaram, a organização em camadas e pacotes, a implantação e o resultado do </w:t>
+      </w:r>
+      <w:r>
+        <w:t>teste da arquitetura com o caso de uso escolhido. É a referência para quem implementa os casos de uso da Construção, junto com o Guia de Implementação.</w:t>
       </w:r>
     </w:p>
     <w:p>
@@ -251,7 +315,10 @@
         <w:t>Definir Arquitetura</w:t>
       </w:r>
       <w:r>
-        <w:t xml:space="preserve"> e o leiaute do template do Visão.</w:t>
+        <w:t xml:space="preserve"> e o leiaute do template do </w:t>
+      </w:r>
+      <w:r>
+        <w:t>Visão.</w:t>
       </w:r>
     </w:p>
     <w:p>
@@ -276,10 +343,7 @@
         <w:t>UC05 — Manter Veículo</w:t>
       </w:r>
       <w:r>
-        <w:t xml:space="preserve">, escolhido pela equipe em 26/09/2026. Não é o caso de uso de maior risco: a regra da potência efetiva (RI-08) entra no sprint 5, o primeiro da Construção, já sobre a arquitetura testada. O UC05 foi escolhido por atravessar </w:t>
-      </w:r>
-      <w:r>
-        <w:t>todas as camadas (tela, API, banco) com regras simples, o que isola o risco tecnológico do risco de negócio.</w:t>
+        <w:t>, escolhido pela equipe em 26/09/2026. Não é o caso de uso de maior risco: a regra da potência efetiva (RI-08) entra no sprint 5, o primeiro da Construção, já sobre a arquitetura testada. O UC05 foi escolhido por atravessar todas as camadas (tela, API, banco) com regras simples, o que isola o risco tecnológico do risco de negócio.</w:t>
       </w:r>
     </w:p>
     <w:p>
@@ -809,8 +873,8 @@
         <w:tblLook w:val="0020" w:firstRow="1" w:lastRow="0" w:firstColumn="0" w:lastColumn="0" w:noHBand="0" w:noVBand="0"/>
       </w:tblPr>
       <w:tblGrid>
-        <w:gridCol w:w="4817"/>
-        <w:gridCol w:w="5037"/>
+        <w:gridCol w:w="5276"/>
+        <w:gridCol w:w="4578"/>
       </w:tblGrid>
       <w:tr>
         <w:trPr>
@@ -819,7 +883,7 @@
         </w:trPr>
         <w:tc>
           <w:tcPr>
-            <w:tcW w:w="2444" w:type="pct"/>
+            <w:tcW w:w="2677" w:type="pct"/>
             <w:shd w:val="clear" w:color="auto" w:fill="D9D9D9"/>
           </w:tcPr>
           <w:p>
@@ -840,7 +904,7 @@
         </w:tc>
         <w:tc>
           <w:tcPr>
-            <w:tcW w:w="2556" w:type="pct"/>
+            <w:tcW w:w="2323" w:type="pct"/>
             <w:shd w:val="clear" w:color="auto" w:fill="D9D9D9"/>
           </w:tcPr>
           <w:p>
@@ -866,7 +930,7 @@
         </w:trPr>
         <w:tc>
           <w:tcPr>
-            <w:tcW w:w="2444" w:type="pct"/>
+            <w:tcW w:w="2677" w:type="pct"/>
           </w:tcPr>
           <w:p>
             <w:pPr>
@@ -887,7 +951,7 @@
         </w:tc>
         <w:tc>
           <w:tcPr>
-            <w:tcW w:w="2556" w:type="pct"/>
+            <w:tcW w:w="2323" w:type="pct"/>
           </w:tcPr>
           <w:p>
             <w:pPr>
@@ -906,7 +970,7 @@
         </w:trPr>
         <w:tc>
           <w:tcPr>
-            <w:tcW w:w="2444" w:type="pct"/>
+            <w:tcW w:w="2677" w:type="pct"/>
           </w:tcPr>
           <w:p>
             <w:pPr>
@@ -927,7 +991,7 @@
         </w:tc>
         <w:tc>
           <w:tcPr>
-            <w:tcW w:w="2556" w:type="pct"/>
+            <w:tcW w:w="2323" w:type="pct"/>
           </w:tcPr>
           <w:p>
             <w:pPr>
@@ -946,7 +1010,7 @@
         </w:trPr>
         <w:tc>
           <w:tcPr>
-            <w:tcW w:w="2444" w:type="pct"/>
+            <w:tcW w:w="2677" w:type="pct"/>
           </w:tcPr>
           <w:p>
             <w:pPr>
@@ -967,7 +1031,7 @@
         </w:tc>
         <w:tc>
           <w:tcPr>
-            <w:tcW w:w="2556" w:type="pct"/>
+            <w:tcW w:w="2323" w:type="pct"/>
           </w:tcPr>
           <w:p>
             <w:pPr>
@@ -986,7 +1050,7 @@
         </w:trPr>
         <w:tc>
           <w:tcPr>
-            <w:tcW w:w="2444" w:type="pct"/>
+            <w:tcW w:w="2677" w:type="pct"/>
           </w:tcPr>
           <w:p>
             <w:pPr>
@@ -1004,7 +1068,7 @@
         </w:tc>
         <w:tc>
           <w:tcPr>
-            <w:tcW w:w="2556" w:type="pct"/>
+            <w:tcW w:w="2323" w:type="pct"/>
           </w:tcPr>
           <w:p>
             <w:pPr>
@@ -1023,7 +1087,7 @@
         </w:trPr>
         <w:tc>
           <w:tcPr>
-            <w:tcW w:w="2444" w:type="pct"/>
+            <w:tcW w:w="2677" w:type="pct"/>
           </w:tcPr>
           <w:p>
             <w:pPr>
@@ -1035,35 +1099,35 @@
                 <w:b/>
                 <w:bCs/>
               </w:rPr>
-              <w:t>Pacotes organizados pelo caso de uso</w:t>
-            </w:r>
-            <w:r>
-              <w:t xml:space="preserve"> (br.edu.ifsp.carregaja.manterveiculo), com as camadas dentro</w:t>
-            </w:r>
-          </w:p>
-        </w:tc>
-        <w:tc>
-          <w:tcPr>
-            <w:tcW w:w="2556" w:type="pct"/>
-          </w:tcPr>
-          <w:p>
-            <w:pPr>
-              <w:spacing w:after="40"/>
-              <w:jc w:val="left"/>
-            </w:pPr>
-            <w:r>
-              <w:t>Pedido do professor na apresentação do sprint 3: o pacote da arquitetura tem o nome do caso de uso. Cada caso de uso fica isolado e fácil de achar.</w:t>
-            </w:r>
-          </w:p>
-        </w:tc>
-      </w:tr>
-      <w:tr>
-        <w:trPr>
-          <w:cantSplit/>
-        </w:trPr>
-        <w:tc>
-          <w:tcPr>
-            <w:tcW w:w="2444" w:type="pct"/>
+              <w:t>Pacotes organizados por camada</w:t>
+            </w:r>
+            <w:r>
+              <w:t xml:space="preserve"> (br.edu.ifsp.carregaja.control, .service, .repository, .model, .view), com o nome do caso de uso na pasta da página (webapp/restricted/manterveiculo) e no pacote dos diagramas (3.Arquitetura::manterveiculo)</w:t>
+            </w:r>
+          </w:p>
+        </w:tc>
+        <w:tc>
+          <w:tcPr>
+            <w:tcW w:w="2323" w:type="pct"/>
+          </w:tcPr>
+          <w:p>
+            <w:pPr>
+              <w:spacing w:after="40"/>
+              <w:jc w:val="left"/>
+            </w:pPr>
+            <w:r>
+              <w:t>Organizar por caso de uso repetiria as mesmas camadas em cada um dos 12 casos de uso. Por camada é a organização dos exercícios de LP2 e do exemplo de arquitetura do professor. O pedido do professor no sprint 3, de o pacote da arquitetura ter o nome do caso de uso, continua atendido na pasta da página e nos diagramas.</w:t>
+            </w:r>
+          </w:p>
+        </w:tc>
+      </w:tr>
+      <w:tr>
+        <w:trPr>
+          <w:cantSplit/>
+        </w:trPr>
+        <w:tc>
+          <w:tcPr>
+            <w:tcW w:w="2677" w:type="pct"/>
           </w:tcPr>
           <w:p>
             <w:pPr>
@@ -1081,7 +1145,7 @@
         </w:tc>
         <w:tc>
           <w:tcPr>
-            <w:tcW w:w="2556" w:type="pct"/>
+            <w:tcW w:w="2323" w:type="pct"/>
           </w:tcPr>
           <w:p>
             <w:pPr>
@@ -1264,10 +1328,7 @@
               <w:jc w:val="left"/>
             </w:pPr>
             <w:r>
-              <w:t xml:space="preserve">Páginas com </w:t>
-            </w:r>
-            <w:r>
-              <w:t>viewport e componentes PrimeFaces responsivos.</w:t>
+              <w:t>Páginas com viewport e componentes PrimeFaces responsivos.</w:t>
             </w:r>
           </w:p>
         </w:tc>
@@ -1479,12 +1540,13 @@
       <w:bookmarkEnd w:id="4"/>
       <w:bookmarkEnd w:id="7"/>
       <w:r>
+        <w:lastRenderedPageBreak/>
         <w:t>Visão Lógica: Camadas e Pacotes</w:t>
       </w:r>
     </w:p>
     <w:p>
       <w:r>
-        <w:t xml:space="preserve">Diagramas: </w:t>
+        <w:t xml:space="preserve">Os pacotes Java ficam em br.edu.ifsp.carregaja, um por camada. Diagramas, no pacote 3.Arquitetura::manterveiculo: </w:t>
       </w:r>
       <w:r>
         <w:rPr>
@@ -1504,7 +1566,10 @@
         <w:t>Pacotes do Back-end — UC05</w:t>
       </w:r>
       <w:r>
-        <w:t>. Em cada diagrama, o que pertence ao outro projeto aparece em cinza, só com o nome.</w:t>
+        <w:t xml:space="preserve">. Em cada diagrama, o </w:t>
+      </w:r>
+      <w:r>
+        <w:t>que pertence ao outro projeto aparece em cinza, só com o nome.</w:t>
       </w:r>
     </w:p>
     <w:p>
@@ -1513,7 +1578,6 @@
       </w:pPr>
       <w:bookmarkStart w:id="9" w:name="Xd25c3406bc4cf7141024718dc9030eee1797ea1"/>
       <w:r>
-        <w:lastRenderedPageBreak/>
         <w:t>Front-end (carregaja-jsf)</w:t>
       </w:r>
     </w:p>
@@ -1665,7 +1729,7 @@
               <w:jc w:val="left"/>
             </w:pPr>
             <w:r>
-              <w:t>manterveiculo.controller</w:t>
+              <w:t>controller</w:t>
             </w:r>
           </w:p>
         </w:tc>
@@ -1712,7 +1776,7 @@
               <w:jc w:val="left"/>
             </w:pPr>
             <w:r>
-              <w:t>manterveiculo.service</w:t>
+              <w:t>service</w:t>
             </w:r>
           </w:p>
         </w:tc>
@@ -1759,7 +1823,7 @@
               <w:jc w:val="left"/>
             </w:pPr>
             <w:r>
-              <w:t>manterveiculo.model</w:t>
+              <w:t>model</w:t>
             </w:r>
           </w:p>
         </w:tc>
@@ -1787,10 +1851,7 @@
               <w:jc w:val="left"/>
             </w:pPr>
             <w:r>
-              <w:t xml:space="preserve">Veiculo, </w:t>
-            </w:r>
-            <w:r>
-              <w:t>VeiculoRequest</w:t>
+              <w:t>Veiculo, VeiculoRequest</w:t>
             </w:r>
           </w:p>
         </w:tc>
@@ -1820,9 +1881,9 @@
         <w:tblLook w:val="0020" w:firstRow="1" w:lastRow="0" w:firstColumn="0" w:lastColumn="0" w:noHBand="0" w:noVBand="0"/>
       </w:tblPr>
       <w:tblGrid>
-        <w:gridCol w:w="2395"/>
-        <w:gridCol w:w="5630"/>
-        <w:gridCol w:w="1829"/>
+        <w:gridCol w:w="1095"/>
+        <w:gridCol w:w="6931"/>
+        <w:gridCol w:w="1828"/>
       </w:tblGrid>
       <w:tr>
         <w:trPr>
@@ -1831,7 +1892,7 @@
         </w:trPr>
         <w:tc>
           <w:tcPr>
-            <w:tcW w:w="1215" w:type="pct"/>
+            <w:tcW w:w="556" w:type="pct"/>
             <w:shd w:val="clear" w:color="auto" w:fill="D9D9D9"/>
           </w:tcPr>
           <w:p>
@@ -1852,7 +1913,7 @@
         </w:tc>
         <w:tc>
           <w:tcPr>
-            <w:tcW w:w="2857" w:type="pct"/>
+            <w:tcW w:w="3517" w:type="pct"/>
             <w:shd w:val="clear" w:color="auto" w:fill="D9D9D9"/>
           </w:tcPr>
           <w:p>
@@ -1899,21 +1960,21 @@
         </w:trPr>
         <w:tc>
           <w:tcPr>
-            <w:tcW w:w="1215" w:type="pct"/>
-          </w:tcPr>
-          <w:p>
-            <w:pPr>
-              <w:spacing w:after="40"/>
-              <w:jc w:val="left"/>
-            </w:pPr>
-            <w:r>
-              <w:t>manterveiculo.control</w:t>
-            </w:r>
-          </w:p>
-        </w:tc>
-        <w:tc>
-          <w:tcPr>
-            <w:tcW w:w="2857" w:type="pct"/>
+            <w:tcW w:w="556" w:type="pct"/>
+          </w:tcPr>
+          <w:p>
+            <w:pPr>
+              <w:spacing w:after="40"/>
+              <w:jc w:val="left"/>
+            </w:pPr>
+            <w:r>
+              <w:t>control</w:t>
+            </w:r>
+          </w:p>
+        </w:tc>
+        <w:tc>
+          <w:tcPr>
+            <w:tcW w:w="3517" w:type="pct"/>
           </w:tcPr>
           <w:p>
             <w:pPr>
@@ -1946,21 +2007,21 @@
         </w:trPr>
         <w:tc>
           <w:tcPr>
-            <w:tcW w:w="1215" w:type="pct"/>
-          </w:tcPr>
-          <w:p>
-            <w:pPr>
-              <w:spacing w:after="40"/>
-              <w:jc w:val="left"/>
-            </w:pPr>
-            <w:r>
-              <w:t>manterveiculo.service</w:t>
-            </w:r>
-          </w:p>
-        </w:tc>
-        <w:tc>
-          <w:tcPr>
-            <w:tcW w:w="2857" w:type="pct"/>
+            <w:tcW w:w="556" w:type="pct"/>
+          </w:tcPr>
+          <w:p>
+            <w:pPr>
+              <w:spacing w:after="40"/>
+              <w:jc w:val="left"/>
+            </w:pPr>
+            <w:r>
+              <w:t>service</w:t>
+            </w:r>
+          </w:p>
+        </w:tc>
+        <w:tc>
+          <w:tcPr>
+            <w:tcW w:w="3517" w:type="pct"/>
           </w:tcPr>
           <w:p>
             <w:pPr>
@@ -1993,21 +2054,21 @@
         </w:trPr>
         <w:tc>
           <w:tcPr>
-            <w:tcW w:w="1215" w:type="pct"/>
-          </w:tcPr>
-          <w:p>
-            <w:pPr>
-              <w:spacing w:after="40"/>
-              <w:jc w:val="left"/>
-            </w:pPr>
-            <w:r>
-              <w:t>manterveiculo.repository</w:t>
-            </w:r>
-          </w:p>
-        </w:tc>
-        <w:tc>
-          <w:tcPr>
-            <w:tcW w:w="2857" w:type="pct"/>
+            <w:tcW w:w="556" w:type="pct"/>
+          </w:tcPr>
+          <w:p>
+            <w:pPr>
+              <w:spacing w:after="40"/>
+              <w:jc w:val="left"/>
+            </w:pPr>
+            <w:r>
+              <w:t>repository</w:t>
+            </w:r>
+          </w:p>
+        </w:tc>
+        <w:tc>
+          <w:tcPr>
+            <w:tcW w:w="3517" w:type="pct"/>
           </w:tcPr>
           <w:p>
             <w:pPr>
@@ -2040,21 +2101,21 @@
         </w:trPr>
         <w:tc>
           <w:tcPr>
-            <w:tcW w:w="1215" w:type="pct"/>
-          </w:tcPr>
-          <w:p>
-            <w:pPr>
-              <w:spacing w:after="40"/>
-              <w:jc w:val="left"/>
-            </w:pPr>
-            <w:r>
-              <w:t>manterveiculo.model</w:t>
-            </w:r>
-          </w:p>
-        </w:tc>
-        <w:tc>
-          <w:tcPr>
-            <w:tcW w:w="2857" w:type="pct"/>
+            <w:tcW w:w="556" w:type="pct"/>
+          </w:tcPr>
+          <w:p>
+            <w:pPr>
+              <w:spacing w:after="40"/>
+              <w:jc w:val="left"/>
+            </w:pPr>
+            <w:r>
+              <w:t>model</w:t>
+            </w:r>
+          </w:p>
+        </w:tc>
+        <w:tc>
+          <w:tcPr>
+            <w:tcW w:w="3517" w:type="pct"/>
           </w:tcPr>
           <w:p>
             <w:pPr>
@@ -2087,21 +2148,21 @@
         </w:trPr>
         <w:tc>
           <w:tcPr>
-            <w:tcW w:w="1215" w:type="pct"/>
-          </w:tcPr>
-          <w:p>
-            <w:pPr>
-              <w:spacing w:after="40"/>
-              <w:jc w:val="left"/>
-            </w:pPr>
-            <w:r>
-              <w:t>manterveiculo.view</w:t>
-            </w:r>
-          </w:p>
-        </w:tc>
-        <w:tc>
-          <w:tcPr>
-            <w:tcW w:w="2857" w:type="pct"/>
+            <w:tcW w:w="556" w:type="pct"/>
+          </w:tcPr>
+          <w:p>
+            <w:pPr>
+              <w:spacing w:after="40"/>
+              <w:jc w:val="left"/>
+            </w:pPr>
+            <w:r>
+              <w:t>view</w:t>
+            </w:r>
+          </w:p>
+        </w:tc>
+        <w:tc>
+          <w:tcPr>
+            <w:tcW w:w="3517" w:type="pct"/>
           </w:tcPr>
           <w:p>
             <w:pPr>
@@ -2149,6 +2210,14 @@
         <w:pStyle w:val="Corpodetexto"/>
       </w:pPr>
       <w:r>
+        <w:t>Um caso de uso novo acrescenta classes às camadas que já existem, sem criar pacote novo. Só a página ganha uma pasta com o nome do caso de uso.</w:t>
+      </w:r>
+    </w:p>
+    <w:p>
+      <w:pPr>
+        <w:pStyle w:val="Corpodetexto"/>
+      </w:pPr>
+      <w:r>
         <w:t xml:space="preserve">Diagramas de classes: </w:t>
       </w:r>
       <w:r>
@@ -2159,7 +2228,10 @@
         <w:t>Classes do Front-end — UC05</w:t>
       </w:r>
       <w:r>
-        <w:t xml:space="preserve"> e </w:t>
+        <w:t xml:space="preserve"> </w:t>
+      </w:r>
+      <w:r>
+        <w:t xml:space="preserve">e </w:t>
       </w:r>
       <w:r>
         <w:rPr>
@@ -2169,10 +2241,7 @@
         <w:t>Classes do Back-end — UC05</w:t>
       </w:r>
       <w:r>
-        <w:t xml:space="preserve">, com todos os atributos e as operações públicas de cada classe, nos nomes e tipos do código. As entidades de </w:t>
-      </w:r>
-      <w:r>
-        <w:t xml:space="preserve">negócio que o UC05 usa estão no diagrama </w:t>
+        <w:t xml:space="preserve">, com todos os atributos e as operações públicas de cada classe, nos nomes e tipos do código. As entidades de negócio que o UC05 usa estão no diagrama </w:t>
       </w:r>
       <w:r>
         <w:rPr>
@@ -2391,7 +2460,10 @@
               <w:jc w:val="left"/>
             </w:pPr>
             <w:r>
-              <w:t>Lombok (@Getter, @Setter, @Slf4j)</w:t>
+              <w:t>Lombok (@Getter</w:t>
+            </w:r>
+            <w:r>
+              <w:t>, @Setter, @Slf4j)</w:t>
             </w:r>
           </w:p>
         </w:tc>
@@ -2662,10 +2734,7 @@
         <w:t>Meu veículo</w:t>
       </w:r>
       <w:r>
-        <w:t>. O ManterVeiculoBean pede a lista ao VeiculoRestClient, que faz GET /veiculos</w:t>
-      </w:r>
-      <w:r>
-        <w:t>. Se já há veículo, os campos vêm preenchidos; se não, vazios.</w:t>
+        <w:t>. O ManterVeiculoBean pede a lista ao VeiculoRestClient, que faz GET /veiculos. Se já há veículo, os campos vêm preenchidos; se não, vazios.</w:t>
       </w:r>
     </w:p>
     <w:p>
@@ -2701,6 +2770,7 @@
         </w:numPr>
       </w:pPr>
       <w:r>
+        <w:lastRenderedPageBreak/>
         <w:t>A página valida: os três campos são obrigatórios, e capacidade e potência devem ser maiores que zero. Se não forem, a mensagem aparece e nada é enviado.</w:t>
       </w:r>
     </w:p>
@@ -2712,7 +2782,10 @@
         </w:numPr>
       </w:pPr>
       <w:r>
-        <w:t>O bean chama criar (veículo sem id) ou atualizar (com id) no VeiculoRestClient, que envia POST /veiculos ou PUT /veiculos/{id} com o VeiculoRequest em JSON.</w:t>
+        <w:t xml:space="preserve">O bean chama criar (veículo sem id) ou atualizar (com id) no </w:t>
+      </w:r>
+      <w:r>
+        <w:t>VeiculoRestClient, que envia POST /veiculos ou PUT /veiculos/{id} com o VeiculoRequest em JSON.</w:t>
       </w:r>
     </w:p>
     <w:p>
@@ -2723,10 +2796,7 @@
         </w:numPr>
       </w:pPr>
       <w:r>
-        <w:t xml:space="preserve">Na API, o @Valid confere o </w:t>
-      </w:r>
-      <w:r>
-        <w:t xml:space="preserve">VeiculoRequest de novo. Inválido, a resposta é </w:t>
+        <w:t xml:space="preserve">Na API, o @Valid confere o VeiculoRequest de novo. Inválido, a resposta é </w:t>
       </w:r>
       <w:r>
         <w:rPr>
@@ -2808,7 +2878,10 @@
         <w:t>Veículo alterado com sucesso</w:t>
       </w:r>
       <w:r>
-        <w:t>. Se a API estiver fora do ar ou responder erro, mostra a mensagem do VeiculoRestClient.</w:t>
+        <w:t xml:space="preserve">. Se a API </w:t>
+      </w:r>
+      <w:r>
+        <w:t>estiver fora do ar ou responder erro, mostra a mensagem do VeiculoRestClient.</w:t>
       </w:r>
     </w:p>
     <w:p>
@@ -2820,10 +2893,7 @@
         <w:t>Ainda sem login.</w:t>
       </w:r>
       <w:r>
-        <w:t xml:space="preserve"> </w:t>
-      </w:r>
-      <w:r>
-        <w:t>Até o UC01 (sprint 5) não há morador identificado: a tela mostra um único veículo. A ligação do veículo ao morador e ao apartamento (HU-05, teste 01) entra com a autenticação, sem mudar as camadas.</w:t>
+        <w:t xml:space="preserve"> Até o UC01 (sprint 5) não há morador identificado: a tela mostra um único veículo. A ligação do veículo ao morador e ao apartamento (HU-05, teste 01) entra com a autenticação, sem mudar as camadas.</w:t>
       </w:r>
     </w:p>
     <w:p>
@@ -2848,7 +2918,7 @@
         <w:t>Modelo de Implantação</w:t>
       </w:r>
       <w:r>
-        <w:t>, pacote 3.Arquitetura.</w:t>
+        <w:t>, pacote 3.Arquitetura::implantação.</w:t>
       </w:r>
     </w:p>
     <w:tbl>
@@ -3013,7 +3083,10 @@
               <w:jc w:val="left"/>
             </w:pPr>
             <w:r>
-              <w:t>carregaja.war (telas)</w:t>
+              <w:t>carregaja.war</w:t>
+            </w:r>
+            <w:r>
+              <w:t xml:space="preserve"> (telas)</w:t>
             </w:r>
           </w:p>
         </w:tc>
@@ -3668,10 +3741,7 @@
         <w:pStyle w:val="Corpodetexto"/>
       </w:pPr>
       <w:r>
-        <w:t xml:space="preserve">Os testes 04 (reuso na sessão) e 05 (troca não altera o passado) dependem do UC03 e entram com ele </w:t>
-      </w:r>
-      <w:r>
-        <w:t>no sprint 5.</w:t>
+        <w:t>Os testes 04 (reuso na sessão) e 05 (troca não altera o passado) dependem do UC03 e entram com ele no sprint 5.</w:t>
       </w:r>
     </w:p>
     <w:p>
@@ -3713,9 +3783,9 @@
         <w:tblLook w:val="0020" w:firstRow="1" w:lastRow="0" w:firstColumn="0" w:lastColumn="0" w:noHBand="0" w:noVBand="0"/>
       </w:tblPr>
       <w:tblGrid>
-        <w:gridCol w:w="1217"/>
-        <w:gridCol w:w="4689"/>
-        <w:gridCol w:w="3948"/>
+        <w:gridCol w:w="1218"/>
+        <w:gridCol w:w="5855"/>
+        <w:gridCol w:w="2781"/>
       </w:tblGrid>
       <w:tr>
         <w:trPr>
@@ -3745,7 +3815,7 @@
         </w:tc>
         <w:tc>
           <w:tcPr>
-            <w:tcW w:w="2379" w:type="pct"/>
+            <w:tcW w:w="2971" w:type="pct"/>
             <w:shd w:val="clear" w:color="auto" w:fill="D9D9D9"/>
           </w:tcPr>
           <w:p>
@@ -3766,7 +3836,7 @@
         </w:tc>
         <w:tc>
           <w:tcPr>
-            <w:tcW w:w="2003" w:type="pct"/>
+            <w:tcW w:w="1412" w:type="pct"/>
             <w:shd w:val="clear" w:color="auto" w:fill="D9D9D9"/>
           </w:tcPr>
           <w:p>
@@ -3806,7 +3876,7 @@
         </w:tc>
         <w:tc>
           <w:tcPr>
-            <w:tcW w:w="2379" w:type="pct"/>
+            <w:tcW w:w="2971" w:type="pct"/>
           </w:tcPr>
           <w:p>
             <w:pPr>
@@ -3820,7 +3890,7 @@
         </w:tc>
         <w:tc>
           <w:tcPr>
-            <w:tcW w:w="2003" w:type="pct"/>
+            <w:tcW w:w="1412" w:type="pct"/>
           </w:tcPr>
           <w:p>
             <w:pPr>
@@ -3853,32 +3923,38 @@
         </w:tc>
         <w:tc>
           <w:tcPr>
-            <w:tcW w:w="2379" w:type="pct"/>
-          </w:tcPr>
-          <w:p>
-            <w:pPr>
-              <w:spacing w:after="40"/>
-              <w:jc w:val="left"/>
-            </w:pPr>
-            <w:r>
-              <w:t>Pacote cadastro renomeado para manterveiculo</w:t>
-            </w:r>
-            <w:r>
-              <w:t>; diagramas separados em front-end e back-end; classes com os nomes e tipos do código</w:t>
-            </w:r>
-          </w:p>
-        </w:tc>
-        <w:tc>
-          <w:tcPr>
-            <w:tcW w:w="2003" w:type="pct"/>
-          </w:tcPr>
-          <w:p>
-            <w:pPr>
-              <w:spacing w:after="40"/>
-              <w:jc w:val="left"/>
-            </w:pPr>
-            <w:r>
-              <w:t>Apontamentos do professor na apresentação do sprint 3</w:t>
+            <w:tcW w:w="2971" w:type="pct"/>
+          </w:tcPr>
+          <w:p>
+            <w:pPr>
+              <w:spacing w:after="40"/>
+              <w:jc w:val="left"/>
+            </w:pPr>
+            <w:r>
+              <w:t xml:space="preserve">Pacote cadastro renomeado para manterveiculo; diagramas </w:t>
+            </w:r>
+            <w:r>
+              <w:lastRenderedPageBreak/>
+              <w:t>separados em front-end e back-end; classes com os nomes e tipos do código</w:t>
+            </w:r>
+          </w:p>
+        </w:tc>
+        <w:tc>
+          <w:tcPr>
+            <w:tcW w:w="1412" w:type="pct"/>
+          </w:tcPr>
+          <w:p>
+            <w:pPr>
+              <w:spacing w:after="40"/>
+              <w:jc w:val="left"/>
+            </w:pPr>
+            <w:r>
+              <w:lastRenderedPageBreak/>
+              <w:t xml:space="preserve">Apontamentos do professor </w:t>
+            </w:r>
+            <w:r>
+              <w:lastRenderedPageBreak/>
+              <w:t>na apresentação do sprint 3</w:t>
             </w:r>
           </w:p>
         </w:tc>
@@ -3897,27 +3973,31 @@
               <w:jc w:val="left"/>
             </w:pPr>
             <w:r>
+              <w:lastRenderedPageBreak/>
               <w:t>25/10/2026</w:t>
             </w:r>
           </w:p>
         </w:tc>
         <w:tc>
           <w:tcPr>
-            <w:tcW w:w="2379" w:type="pct"/>
-          </w:tcPr>
-          <w:p>
-            <w:pPr>
-              <w:spacing w:after="40"/>
-              <w:jc w:val="left"/>
-            </w:pPr>
-            <w:r>
-              <w:t>Projeto dividido em carregaja-api e carregaja-jsf, no modelo dos exercícios de LP2: camadas control, service, repository, model e view na API e cliente REST na tela; Modelo de Implantação</w:t>
-            </w:r>
-          </w:p>
-        </w:tc>
-        <w:tc>
-          <w:tcPr>
-            <w:tcW w:w="2003" w:type="pct"/>
+            <w:tcW w:w="2971" w:type="pct"/>
+          </w:tcPr>
+          <w:p>
+            <w:pPr>
+              <w:spacing w:after="40"/>
+              <w:jc w:val="left"/>
+            </w:pPr>
+            <w:r>
+              <w:t xml:space="preserve">Projeto dividido em carregaja-api e carregaja-jsf, no modelo dos exercícios de LP2: camadas control, service, repository, model e view </w:t>
+            </w:r>
+            <w:r>
+              <w:t>na API e cliente REST na tela; Modelo de Implantação</w:t>
+            </w:r>
+          </w:p>
+        </w:tc>
+        <w:tc>
+          <w:tcPr>
+            <w:tcW w:w="1412" w:type="pct"/>
           </w:tcPr>
           <w:p>
             <w:pPr>
@@ -3926,6 +4006,53 @@
             </w:pPr>
             <w:r>
               <w:t>A separação de front-end e back-end, antes só nos diagramas, passou a existir no código. A organização segue a da disciplina integrada (RE-02)</w:t>
+            </w:r>
+          </w:p>
+        </w:tc>
+      </w:tr>
+      <w:tr>
+        <w:trPr>
+          <w:cantSplit/>
+        </w:trPr>
+        <w:tc>
+          <w:tcPr>
+            <w:tcW w:w="618" w:type="pct"/>
+          </w:tcPr>
+          <w:p>
+            <w:pPr>
+              <w:spacing w:after="40"/>
+              <w:jc w:val="left"/>
+            </w:pPr>
+            <w:r>
+              <w:t>26/10/2026</w:t>
+            </w:r>
+          </w:p>
+        </w:tc>
+        <w:tc>
+          <w:tcPr>
+            <w:tcW w:w="2971" w:type="pct"/>
+          </w:tcPr>
+          <w:p>
+            <w:pPr>
+              <w:spacing w:after="40"/>
+              <w:jc w:val="left"/>
+            </w:pPr>
+            <w:r>
+              <w:t>Pacotes por camada, direto em cada projeto (br.edu.ifsp.carregaja.control em vez de br.edu.ifsp.carregaja.manterveiculo.control); no Astah, 3.Arquitetura reduzido a carregaja-jsf, carregaja-api, manterveiculo (diagramas do UC05) e implantação</w:t>
+            </w:r>
+          </w:p>
+        </w:tc>
+        <w:tc>
+          <w:tcPr>
+            <w:tcW w:w="1412" w:type="pct"/>
+          </w:tcPr>
+          <w:p>
+            <w:pPr>
+              <w:spacing w:after="40"/>
+              <w:jc w:val="left"/>
+            </w:pPr>
+            <w:r>
+              <w:t>Por caso de uso, cada um dos 12 casos de uso repetiria as cinco camadas. O nome do caso de uso ficou na pasta da página e no pacote dos diagramas</w:t>
             </w:r>
           </w:p>
         </w:tc>
@@ -4423,7 +4550,7 @@
             <w:rPr>
               <w:b/>
             </w:rPr>
-            <w:pict w14:anchorId="5EA2A74E">
+            <w:pict w14:anchorId="214AFB11">
               <v:shapetype id="_x0000_t75" coordsize="21600,21600" o:spt="75" o:preferrelative="t" path="m@4@5l@4@11@9@11@9@5xe" filled="f" stroked="f">
                 <v:stroke joinstyle="miter"/>
                 <v:formulas>
@@ -4443,7 +4570,7 @@
                 <v:path o:extrusionok="f" gradientshapeok="t" o:connecttype="rect"/>
                 <o:lock v:ext="edit" aspectratio="t"/>
               </v:shapetype>
-              <v:shape id="_x0000_i1025" type="#_x0000_t75" style="width:61.8pt;height:34.8pt">
+              <v:shape id="_x0000_i1025" type="#_x0000_t75" style="width:61.5pt;height:34.5pt">
                 <v:imagedata r:id="rId1" o:title=""/>
               </v:shape>
             </w:pict>
@@ -4465,7 +4592,7 @@
   <w:abstractNum w:abstractNumId="0" w15:restartNumberingAfterBreak="0">
     <w:nsid w:val="0000A990"/>
     <w:multiLevelType w:val="multilevel"/>
-    <w:tmpl w:val="F3A0FBCE"/>
+    <w:tmpl w:val="E1504D88"/>
     <w:lvl w:ilvl="0">
       <w:numFmt w:val="bullet"/>
       <w:lvlText w:val=" "/>
@@ -4542,7 +4669,7 @@
   <w:abstractNum w:abstractNumId="1" w15:restartNumberingAfterBreak="0">
     <w:nsid w:val="00A99411"/>
     <w:multiLevelType w:val="multilevel"/>
-    <w:tmpl w:val="0BAC2720"/>
+    <w:tmpl w:val="C5029078"/>
     <w:lvl w:ilvl="0">
       <w:start w:val="1"/>
       <w:numFmt w:val="decimal"/>
@@ -5417,40 +5544,40 @@
       </w:rPr>
     </w:lvl>
   </w:abstractNum>
-  <w:num w:numId="1" w16cid:durableId="940144055">
+  <w:num w:numId="1" w16cid:durableId="340396716">
     <w:abstractNumId w:val="6"/>
   </w:num>
-  <w:num w:numId="2" w16cid:durableId="818229794">
+  <w:num w:numId="2" w16cid:durableId="1439833573">
     <w:abstractNumId w:val="8"/>
   </w:num>
-  <w:num w:numId="3" w16cid:durableId="382484062">
+  <w:num w:numId="3" w16cid:durableId="798691702">
     <w:abstractNumId w:val="8"/>
   </w:num>
-  <w:num w:numId="4" w16cid:durableId="1902599242">
+  <w:num w:numId="4" w16cid:durableId="2026786970">
     <w:abstractNumId w:val="8"/>
   </w:num>
-  <w:num w:numId="5" w16cid:durableId="720790564">
+  <w:num w:numId="5" w16cid:durableId="406417867">
     <w:abstractNumId w:val="8"/>
   </w:num>
-  <w:num w:numId="6" w16cid:durableId="1261983777">
+  <w:num w:numId="6" w16cid:durableId="700083676">
     <w:abstractNumId w:val="3"/>
   </w:num>
-  <w:num w:numId="7" w16cid:durableId="1981693038">
+  <w:num w:numId="7" w16cid:durableId="585531144">
     <w:abstractNumId w:val="2"/>
   </w:num>
-  <w:num w:numId="8" w16cid:durableId="456607831">
+  <w:num w:numId="8" w16cid:durableId="1080756859">
     <w:abstractNumId w:val="4"/>
   </w:num>
-  <w:num w:numId="9" w16cid:durableId="911502306">
+  <w:num w:numId="9" w16cid:durableId="1546403044">
     <w:abstractNumId w:val="7"/>
   </w:num>
-  <w:num w:numId="10" w16cid:durableId="1741898903">
+  <w:num w:numId="10" w16cid:durableId="2065369084">
     <w:abstractNumId w:val="5"/>
   </w:num>
-  <w:num w:numId="11" w16cid:durableId="1936283149">
+  <w:num w:numId="11" w16cid:durableId="1736856488">
     <w:abstractNumId w:val="0"/>
   </w:num>
-  <w:num w:numId="12" w16cid:durableId="1893614933">
+  <w:num w:numId="12" w16cid:durableId="249967294">
     <w:abstractNumId w:val="1"/>
     <w:lvlOverride w:ilvl="0">
       <w:startOverride w:val="1"/>

</xml_diff>